<commit_message>
Update ИСИТ_№3 (не запускал), Tech BD, Communication etc.
</commit_message>
<xml_diff>
--- a/Деловые коммуникации/Практика/ББМО_01_25_Железняков_РА_ПР_3.docx
+++ b/Деловые коммуникации/Практика/ББМО_01_25_Железняков_РА_ПР_3.docx
@@ -399,7 +399,6 @@
           <w:lang w:eastAsia="zh-CN"/>
         </w:rPr>
       </w:pPr>
-      <w:proofErr w:type="spellStart"/>
       <w:r>
         <w:rPr>
           <w:rFonts w:ascii="Times New Roman" w:hAnsi="Times New Roman" w:cs="Times New Roman"/>
@@ -407,17 +406,7 @@
           <w:szCs w:val="28"/>
           <w:lang w:eastAsia="zh-CN"/>
         </w:rPr>
-        <w:t>Молякина</w:t>
-      </w:r>
-      <w:proofErr w:type="spellEnd"/>
-      <w:r>
-        <w:rPr>
-          <w:rFonts w:ascii="Times New Roman" w:hAnsi="Times New Roman" w:cs="Times New Roman"/>
-          <w:sz w:val="28"/>
-          <w:szCs w:val="28"/>
-          <w:lang w:eastAsia="zh-CN"/>
-        </w:rPr>
-        <w:t xml:space="preserve"> Наталия </w:t>
+        <w:t xml:space="preserve">Молякина Наталия </w:t>
       </w:r>
     </w:p>
     <w:p>
@@ -543,6 +532,26 @@
           <w:szCs w:val="28"/>
         </w:rPr>
         <w:lastRenderedPageBreak/>
+        <w:t>Задание 3</w:t>
+      </w:r>
+    </w:p>
+    <w:p>
+      <w:pPr>
+        <w:spacing w:after="0" w:line="360" w:lineRule="auto"/>
+        <w:ind w:firstLine="708"/>
+        <w:jc w:val="both"/>
+        <w:rPr>
+          <w:rFonts w:ascii="Times New Roman" w:hAnsi="Times New Roman" w:cs="Times New Roman"/>
+          <w:sz w:val="28"/>
+          <w:szCs w:val="28"/>
+        </w:rPr>
+      </w:pPr>
+      <w:r>
+        <w:rPr>
+          <w:rFonts w:ascii="Times New Roman" w:hAnsi="Times New Roman" w:cs="Times New Roman"/>
+          <w:sz w:val="28"/>
+          <w:szCs w:val="28"/>
+        </w:rPr>
         <w:t xml:space="preserve">1. Рассмотрите основные характеристики вербальной и невербальной коммуникации, приведите примеры их использования в деловой среде. </w:t>
       </w:r>
     </w:p>
@@ -763,25 +772,7 @@
           <w:sz w:val="28"/>
           <w:szCs w:val="28"/>
         </w:rPr>
-        <w:t>Способность к абстракции</w:t>
-      </w:r>
-      <w:proofErr w:type="gramStart"/>
-      <w:r>
-        <w:rPr>
-          <w:rFonts w:ascii="Times New Roman" w:hAnsi="Times New Roman" w:cs="Times New Roman"/>
-          <w:sz w:val="28"/>
-          <w:szCs w:val="28"/>
-        </w:rPr>
-        <w:t>: Позволяет</w:t>
-      </w:r>
-      <w:proofErr w:type="gramEnd"/>
-      <w:r>
-        <w:rPr>
-          <w:rFonts w:ascii="Times New Roman" w:hAnsi="Times New Roman" w:cs="Times New Roman"/>
-          <w:sz w:val="28"/>
-          <w:szCs w:val="28"/>
-        </w:rPr>
-        <w:t xml:space="preserve"> говорить о понятиях, которые не существуют в материальном мире (например, "стратегия", "эффективность", "лояльность").</w:t>
+        <w:t>Способность к абстракции: Позволяет говорить о понятиях, которые не существуют в материальном мире (например, "стратегия", "эффективность", "лояльность").</w:t>
       </w:r>
     </w:p>
     <w:p>
@@ -909,6 +900,7 @@
           <w:sz w:val="28"/>
           <w:szCs w:val="28"/>
         </w:rPr>
+        <w:lastRenderedPageBreak/>
         <w:t>Публичные выступления: Презентация нового продукта инвесторам, где требуется четко, структурированно и убедительно донести информацию.</w:t>
       </w:r>
     </w:p>
@@ -937,7 +929,6 @@
           <w:sz w:val="28"/>
           <w:szCs w:val="28"/>
         </w:rPr>
-        <w:lastRenderedPageBreak/>
         <w:t>Деловые переговоры: Обсуждение условий контракта, где важна точность формулировок и умение аргументировать свою позицию.</w:t>
       </w:r>
     </w:p>
@@ -1190,25 +1181,7 @@
           <w:sz w:val="28"/>
           <w:szCs w:val="28"/>
         </w:rPr>
-        <w:t xml:space="preserve">Универсальность и культурная специфичность: Некоторые выражения (например, улыбка) универсальны, но многие жесты и нормы </w:t>
-      </w:r>
-      <w:proofErr w:type="spellStart"/>
-      <w:r>
-        <w:rPr>
-          <w:rFonts w:ascii="Times New Roman" w:hAnsi="Times New Roman" w:cs="Times New Roman"/>
-          <w:sz w:val="28"/>
-          <w:szCs w:val="28"/>
-        </w:rPr>
-        <w:t>проксемики</w:t>
-      </w:r>
-      <w:proofErr w:type="spellEnd"/>
-      <w:r>
-        <w:rPr>
-          <w:rFonts w:ascii="Times New Roman" w:hAnsi="Times New Roman" w:cs="Times New Roman"/>
-          <w:sz w:val="28"/>
-          <w:szCs w:val="28"/>
-        </w:rPr>
-        <w:t xml:space="preserve"> (дистанции) сильно различаются в разных культурах.</w:t>
+        <w:t>Универсальность и культурная специфичность: Некоторые выражения (например, улыбка) универсальны, но многие жесты и нормы проксемики (дистанции) сильно различаются в разных культурах.</w:t>
       </w:r>
     </w:p>
     <w:p>
@@ -1236,43 +1209,7 @@
           <w:sz w:val="28"/>
           <w:szCs w:val="28"/>
         </w:rPr>
-        <w:t xml:space="preserve">Синтез различных каналов: Невербальное сообщение передается одновременно по нескольким каналам: </w:t>
-      </w:r>
-      <w:proofErr w:type="spellStart"/>
-      <w:r>
-        <w:rPr>
-          <w:rFonts w:ascii="Times New Roman" w:hAnsi="Times New Roman" w:cs="Times New Roman"/>
-          <w:sz w:val="28"/>
-          <w:szCs w:val="28"/>
-        </w:rPr>
-        <w:t>кинесика</w:t>
-      </w:r>
-      <w:proofErr w:type="spellEnd"/>
-      <w:r>
-        <w:rPr>
-          <w:rFonts w:ascii="Times New Roman" w:hAnsi="Times New Roman" w:cs="Times New Roman"/>
-          <w:sz w:val="28"/>
-          <w:szCs w:val="28"/>
-        </w:rPr>
-        <w:t xml:space="preserve"> (движения), просодика (интонация, тембр), </w:t>
-      </w:r>
-      <w:proofErr w:type="spellStart"/>
-      <w:r>
-        <w:rPr>
-          <w:rFonts w:ascii="Times New Roman" w:hAnsi="Times New Roman" w:cs="Times New Roman"/>
-          <w:sz w:val="28"/>
-          <w:szCs w:val="28"/>
-        </w:rPr>
-        <w:t>проксемика</w:t>
-      </w:r>
-      <w:proofErr w:type="spellEnd"/>
-      <w:r>
-        <w:rPr>
-          <w:rFonts w:ascii="Times New Roman" w:hAnsi="Times New Roman" w:cs="Times New Roman"/>
-          <w:sz w:val="28"/>
-          <w:szCs w:val="28"/>
-        </w:rPr>
-        <w:t xml:space="preserve"> (пространство) и т.д.</w:t>
+        <w:t>Синтез различных каналов: Невербальное сообщение передается одновременно по нескольким каналам: кинесика (движения), просодика (интонация, тембр), проксемика (пространство) и т.д.</w:t>
       </w:r>
     </w:p>
     <w:p>
@@ -1322,6 +1259,7 @@
           <w:sz w:val="28"/>
           <w:szCs w:val="28"/>
         </w:rPr>
+        <w:lastRenderedPageBreak/>
         <w:t>Язык тела на переговорах: Открытая поза (раскрытые ладони, расслабленные плечи) демонстрирует готовность к диалогу, в то время как скрещенные руки и ноги могут быть восприняты как защита и несогласие.</w:t>
       </w:r>
     </w:p>
@@ -1352,7 +1290,6 @@
           <w:sz w:val="28"/>
           <w:szCs w:val="28"/>
         </w:rPr>
-        <w:lastRenderedPageBreak/>
         <w:t>Визуальный контакт во время собеседования: Уверенный, прямой (но не пристальный) взгляд говорит о внимании и уверенности кандидата. Бегающий или опущенный взгляд может свидетельствовать о нервозности или неискренности.</w:t>
       </w:r>
     </w:p>
@@ -1636,7 +1573,16 @@
           <w:sz w:val="28"/>
           <w:szCs w:val="28"/>
         </w:rPr>
-        <w:t> «текущие задачи важнее, чем</w:t>
+        <w:t xml:space="preserve"> «текущие </w:t>
+      </w:r>
+      <w:r>
+        <w:rPr>
+          <w:rFonts w:ascii="Times New Roman" w:hAnsi="Times New Roman" w:cs="Times New Roman"/>
+          <w:sz w:val="28"/>
+          <w:szCs w:val="28"/>
+        </w:rPr>
+        <w:lastRenderedPageBreak/>
+        <w:t>задачи важнее, чем</w:t>
       </w:r>
       <w:r>
         <w:rPr>
@@ -1684,16 +1630,7 @@
           <w:sz w:val="28"/>
           <w:szCs w:val="28"/>
         </w:rPr>
-        <w:t xml:space="preserve"> говорящего возникает ощущение, что его не ценят, его сообщение </w:t>
-      </w:r>
-      <w:r>
-        <w:rPr>
-          <w:rFonts w:ascii="Times New Roman" w:hAnsi="Times New Roman" w:cs="Times New Roman"/>
-          <w:sz w:val="28"/>
-          <w:szCs w:val="28"/>
-        </w:rPr>
-        <w:lastRenderedPageBreak/>
-        <w:t>незначимо. Это подрывает доверие и создает барьер для общения.</w:t>
+        <w:t xml:space="preserve"> говорящего возникает ощущение, что его не ценят, его сообщение незначимо. Это подрывает доверие и создает барьер для общения.</w:t>
       </w:r>
       <w:r>
         <w:rPr>
@@ -1905,15 +1842,7 @@
           <w:sz w:val="28"/>
           <w:szCs w:val="28"/>
         </w:rPr>
-        <w:t xml:space="preserve">Как итог, </w:t>
-      </w:r>
-      <w:r>
-        <w:rPr>
-          <w:rFonts w:ascii="Times New Roman" w:hAnsi="Times New Roman" w:cs="Times New Roman"/>
-          <w:sz w:val="28"/>
-          <w:szCs w:val="28"/>
-        </w:rPr>
-        <w:t>невербальные сигналы могут полностью перечеркнуть вербальное сообщение, каким бы важным оно ни было. Они:</w:t>
+        <w:t>Как итог, невербальные сигналы могут полностью перечеркнуть вербальное сообщение, каким бы важным оно ни было. Они:</w:t>
       </w:r>
     </w:p>
     <w:p>
@@ -8407,6 +8336,7 @@
   <w:style w:type="character" w:default="1" w:styleId="a0">
     <w:name w:val="Default Paragraph Font"/>
     <w:uiPriority w:val="1"/>
+    <w:semiHidden/>
     <w:unhideWhenUsed/>
   </w:style>
   <w:style w:type="table" w:default="1" w:styleId="a1">

</xml_diff>